<commit_message>
chore: renormalize line endings (targeted)
</commit_message>
<xml_diff>
--- a/docs/CORE_ENGINE_GOVERNANCE_EXECUTION_LAW.docx
+++ b/docs/CORE_ENGINE_GOVERNANCE_EXECUTION_LAW.docx
@@ -1,2416 +1,3 @@
-
-<file path=word/document.xml><?xml version="1.0" encoding="utf-8"?>
-<w:document xmlns:wpc="http://schemas.microsoft.com/office/word/2010/wordprocessingCanvas" xmlns:cx="http://schemas.microsoft.com/office/drawing/2014/chartex" xmlns:cx1="http://schemas.microsoft.com/office/drawing/2015/9/8/chartex" xmlns:cx2="http://schemas.microsoft.com/office/drawing/2015/10/21/chartex" xmlns:cx3="http://schemas.microsoft.com/office/drawing/2016/5/9/chartex" xmlns:cx4="http://schemas.microsoft.com/office/drawing/2016/5/10/chartex" xmlns:cx5="http://schemas.microsoft.com/office/drawing/2016/5/11/chartex" xmlns:cx6="http://schemas.microsoft.com/office/drawing/2016/5/12/chartex" xmlns:cx7="http://schemas.microsoft.com/office/drawing/2016/5/13/chartex" xmlns:cx8="http://schemas.microsoft.com/office/drawing/2016/5/14/chartex" xmlns:mc="http://schemas.openxmlformats.org/markup-compatibility/2006" xmlns:aink="http://schemas.microsoft.com/office/drawing/2016/ink" xmlns:am3d="http://schemas.microsoft.com/office/drawing/2017/model3d" xmlns:o="urn:schemas-microsoft-com:office:office" xmlns:oel="http://schemas.microsoft.com/office/2019/extlst" xmlns:r="http://schemas.openxmlformats.org/officeDocument/2006/relationships" xmlns:m="http://schemas.openxmlformats.org/officeDocument/2006/math" xmlns:v="urn:schemas-microsoft-com:vml" xmlns:wp14="http://schemas.microsoft.com/office/word/2010/wordprocessingDrawing" xmlns:wp="http://schemas.openxmlformats.org/drawingml/2006/wordprocessingDrawing" xmlns:w10="urn:schemas-microsoft-com:office:word" xmlns:w="http://schemas.openxmlformats.org/wordprocessingml/2006/main" xmlns:w14="http://schemas.microsoft.com/office/word/2010/wordml" xmlns:w15="http://schemas.microsoft.com/office/word/2012/wordml" xmlns:w16cex="http://schemas.microsoft.com/office/word/2018/wordml/cex" xmlns:w16cid="http://schemas.microsoft.com/office/word/2016/wordml/cid" xmlns:w16="http://schemas.microsoft.com/office/word/2018/wordml" xmlns:w16du="http://schemas.microsoft.com/office/word/2023/wordml/word16du" xmlns:w16sdtdh="http://schemas.microsoft.com/office/word/2020/wordml/sdtdatahash" xmlns:w16sdtfl="http://schemas.microsoft.com/office/word/2024/wordml/sdtformatlock" xmlns:w16se="http://schemas.microsoft.com/office/word/2015/wordml/symex" xmlns:wpg="http://schemas.microsoft.com/office/word/2010/wordprocessingGroup" xmlns:wpi="http://schemas.microsoft.com/office/word/2010/wordprocessingInk" xmlns:wne="http://schemas.microsoft.com/office/word/2006/wordml" xmlns:wps="http://schemas.microsoft.com/office/word/2010/wordprocessingShape" mc:Ignorable="w14 w15 w16se w16cid w16 w16cex w16sdtdh w16sdtfl w16du wp14">
-  <w:body>
-    <w:p>
-      <w:pPr>
-        <w:pStyle w:val="Heading2"/>
-        <w:keepNext w:val="0"/>
-        <w:keepLines w:val="0"/>
-        <w:spacing w:after="80"/>
-        <w:rPr>
-          <w:b/>
-          <w:bCs/>
-          <w:sz w:val="34"/>
-          <w:szCs w:val="34"/>
-        </w:rPr>
-      </w:pPr>
-      <w:r>
-        <w:rPr>
-          <w:b/>
-          <w:bCs/>
-          <w:sz w:val="34"/>
-          <w:szCs w:val="34"/>
-        </w:rPr>
-        <w:t>CORE ENGINE, GOVERNANCE &amp; EXECUTION LAW</w:t>
-      </w:r>
-    </w:p>
-    <w:p>
-      <w:pPr>
-        <w:rPr>
-          <w:rFonts w:ascii="Roboto Mono" w:eastAsia="Roboto Mono" w:hAnsi="Roboto Mono" w:cs="Roboto Mono"/>
-          <w:color w:val="188038"/>
-          <w:lang w:val="en-GB"/>
-        </w:rPr>
-      </w:pPr>
-      <w:r>
-        <w:rPr>
-          <w:b/>
-          <w:bCs/>
-        </w:rPr>
-        <w:t>Version:</w:t>
-      </w:r>
-      <w:r>
-        <w:t xml:space="preserve"> v1.0.0</w:t>
-      </w:r>
-      <w:r>
-        <w:br/>
-      </w:r>
-      <w:r>
-        <w:rPr>
-          <w:b/>
-          <w:bCs/>
-        </w:rPr>
-        <w:t>Status:</w:t>
-      </w:r>
-      <w:r>
-        <w:t xml:space="preserve"> Canonical</w:t>
-      </w:r>
-      <w:r>
-        <w:br/>
-      </w:r>
-      <w:r>
-        <w:rPr>
-          <w:b/>
-          <w:bCs/>
-        </w:rPr>
-        <w:t>Authority Level:</w:t>
-      </w:r>
-      <w:r>
-        <w:t xml:space="preserve"> Engine Law (Supreme)</w:t>
-      </w:r>
-      <w:r>
-        <w:br/>
-      </w:r>
-      <w:r>
-        <w:rPr>
-          <w:b/>
-          <w:bCs/>
-        </w:rPr>
-        <w:t>Placement:</w:t>
-      </w:r>
-      <w:r>
-        <w:rPr>
-          <w:b/>
-          <w:bCs/>
-        </w:rPr>
-        <w:br/>
-      </w:r>
-      <w:r>
-        <w:rPr>
-          <w:rFonts w:ascii="Roboto Mono" w:eastAsia="Roboto Mono" w:hAnsi="Roboto Mono" w:cs="Roboto Mono"/>
-          <w:color w:val="188038"/>
-        </w:rPr>
-        <w:t>\Users\rober\Downloads\</w:t>
-      </w:r>
-      <w:proofErr w:type="spellStart"/>
-      <w:r>
-        <w:rPr>
-          <w:rFonts w:ascii="Roboto Mono" w:eastAsia="Roboto Mono" w:hAnsi="Roboto Mono" w:cs="Roboto Mono"/>
-          <w:color w:val="188038"/>
-        </w:rPr>
-        <w:t>kolosseum_docs</w:t>
-      </w:r>
-      <w:proofErr w:type="spellEnd"/>
-      <w:r>
-        <w:rPr>
-          <w:rFonts w:ascii="Roboto Mono" w:eastAsia="Roboto Mono" w:hAnsi="Roboto Mono" w:cs="Roboto Mono"/>
-          <w:color w:val="188038"/>
-        </w:rPr>
-        <w:t>\</w:t>
-      </w:r>
-      <w:r>
-        <w:rPr>
-          <w:rFonts w:ascii="Roboto Mono" w:eastAsia="Roboto Mono" w:hAnsi="Roboto Mono" w:cs="Roboto Mono"/>
-          <w:color w:val="188038"/>
-          <w:lang w:val="en-GB"/>
-        </w:rPr>
-        <w:t>core_engine_governance_execution_law.docx</w:t>
-      </w:r>
-    </w:p>
-    <w:p>
-      <w:pPr>
-        <w:spacing w:before="240" w:after="240"/>
-        <w:rPr>
-          <w:b/>
-          <w:bCs/>
-        </w:rPr>
-      </w:pPr>
-      <w:r>
-        <w:rPr>
-          <w:b/>
-          <w:bCs/>
-        </w:rPr>
-        <w:t>Referenced by:</w:t>
-      </w:r>
-    </w:p>
-    <w:p>
-      <w:pPr>
-        <w:numPr>
-          <w:ilvl w:val="0"/>
-          <w:numId w:val="18"/>
-        </w:numPr>
-        <w:spacing w:before="240"/>
-      </w:pPr>
-      <w:r>
-        <w:t>MASTER_KOLOSSEUM_ENGINE (index only)</w:t>
-      </w:r>
-    </w:p>
-    <w:p>
-      <w:pPr>
-        <w:numPr>
-          <w:ilvl w:val="0"/>
-          <w:numId w:val="18"/>
-        </w:numPr>
-      </w:pPr>
-      <w:r>
-        <w:t>SESSION &amp; EVENT STRUCTURE LAW</w:t>
-      </w:r>
-    </w:p>
-    <w:p>
-      <w:pPr>
-        <w:numPr>
-          <w:ilvl w:val="0"/>
-          <w:numId w:val="18"/>
-        </w:numPr>
-      </w:pPr>
-      <w:r>
-        <w:t>REGISTRY 5D — SPORT PROGRAM PROFILES</w:t>
-      </w:r>
-    </w:p>
-    <w:p>
-      <w:pPr>
-        <w:numPr>
-          <w:ilvl w:val="0"/>
-          <w:numId w:val="18"/>
-        </w:numPr>
-      </w:pPr>
-      <w:r>
-        <w:t>REGISTRY 5F — SPORT PROGRAM TEMPLATES</w:t>
-      </w:r>
-    </w:p>
-    <w:p>
-      <w:pPr>
-        <w:numPr>
-          <w:ilvl w:val="0"/>
-          <w:numId w:val="18"/>
-        </w:numPr>
-      </w:pPr>
-      <w:r>
-        <w:t>PHASE 1 SCHEMA CROSS-LOCK</w:t>
-      </w:r>
-    </w:p>
-    <w:p>
-      <w:pPr>
-        <w:numPr>
-          <w:ilvl w:val="0"/>
-          <w:numId w:val="18"/>
-        </w:numPr>
-        <w:spacing w:after="240"/>
-      </w:pPr>
-      <w:r>
-        <w:t>DEV DOCS</w:t>
-      </w:r>
-    </w:p>
-    <w:p>
-      <w:pPr>
-        <w:spacing w:before="240" w:after="240"/>
-      </w:pPr>
-      <w:r>
-        <w:pict w14:anchorId="209A1297">
-          <v:rect id="_x0000_i1025" style="width:0;height:1.5pt" o:hralign="center" o:hrstd="t" o:hr="t" fillcolor="#a0a0a0" stroked="f"/>
-        </w:pict>
-      </w:r>
-    </w:p>
-    <w:p>
-      <w:pPr>
-        <w:pStyle w:val="Heading2"/>
-        <w:keepNext w:val="0"/>
-        <w:keepLines w:val="0"/>
-        <w:spacing w:after="80"/>
-        <w:rPr>
-          <w:b/>
-          <w:bCs/>
-          <w:sz w:val="34"/>
-          <w:szCs w:val="34"/>
-        </w:rPr>
-      </w:pPr>
-      <w:bookmarkStart w:id="0" w:name="_4kaz3beh5c" w:colFirst="0" w:colLast="0"/>
-      <w:bookmarkEnd w:id="0"/>
-      <w:r>
-        <w:rPr>
-          <w:b/>
-          <w:bCs/>
-          <w:sz w:val="34"/>
-          <w:szCs w:val="34"/>
-        </w:rPr>
-        <w:t>1. Purpose</w:t>
-      </w:r>
-    </w:p>
-    <w:p>
-      <w:pPr>
-        <w:spacing w:before="240" w:after="240"/>
-      </w:pPr>
-      <w:r>
-        <w:t xml:space="preserve">This law defines the </w:t>
-      </w:r>
-      <w:r>
-        <w:rPr>
-          <w:b/>
-          <w:bCs/>
-        </w:rPr>
-        <w:t>non-negotiable operating principles</w:t>
-      </w:r>
-      <w:r>
-        <w:t xml:space="preserve"> of the Kolosseum engine.</w:t>
-      </w:r>
-    </w:p>
-    <w:p>
-      <w:pPr>
-        <w:spacing w:before="240" w:after="240"/>
-      </w:pPr>
-      <w:r>
-        <w:t>It establishes:</w:t>
-      </w:r>
-    </w:p>
-    <w:p>
-      <w:pPr>
-        <w:numPr>
-          <w:ilvl w:val="0"/>
-          <w:numId w:val="2"/>
-        </w:numPr>
-        <w:spacing w:before="240"/>
-      </w:pPr>
-      <w:r>
-        <w:t xml:space="preserve">what the engine </w:t>
-      </w:r>
-      <w:r>
-        <w:rPr>
-          <w:b/>
-          <w:bCs/>
-        </w:rPr>
-        <w:t>is allowed to do</w:t>
-      </w:r>
-      <w:r>
-        <w:t>,</w:t>
-      </w:r>
-    </w:p>
-    <w:p>
-      <w:pPr>
-        <w:numPr>
-          <w:ilvl w:val="0"/>
-          <w:numId w:val="2"/>
-        </w:numPr>
-      </w:pPr>
-      <w:r>
-        <w:t xml:space="preserve">what it is </w:t>
-      </w:r>
-      <w:r>
-        <w:rPr>
-          <w:b/>
-          <w:bCs/>
-        </w:rPr>
-        <w:t>forbidden to do</w:t>
-      </w:r>
-      <w:r>
-        <w:t>,</w:t>
-      </w:r>
-    </w:p>
-    <w:p>
-      <w:pPr>
-        <w:numPr>
-          <w:ilvl w:val="0"/>
-          <w:numId w:val="2"/>
-        </w:numPr>
-      </w:pPr>
-      <w:r>
-        <w:t>how authority, governance, and execution responsibility are assigned,</w:t>
-      </w:r>
-    </w:p>
-    <w:p>
-      <w:pPr>
-        <w:numPr>
-          <w:ilvl w:val="0"/>
-          <w:numId w:val="2"/>
-        </w:numPr>
-        <w:spacing w:after="240"/>
-      </w:pPr>
-      <w:r>
-        <w:t>and how conflicts are treated.</w:t>
-      </w:r>
-    </w:p>
-    <w:p>
-      <w:pPr>
-        <w:spacing w:before="240" w:after="240"/>
-      </w:pPr>
-      <w:r>
-        <w:t>This document overrides all lower-level specifications in the event of conflict.</w:t>
-      </w:r>
-    </w:p>
-    <w:p>
-      <w:pPr>
-        <w:spacing w:before="240" w:after="240"/>
-      </w:pPr>
-      <w:r>
-        <w:pict w14:anchorId="16C01EC6">
-          <v:rect id="_x0000_i1026" style="width:0;height:1.5pt" o:hralign="center" o:hrstd="t" o:hr="t" fillcolor="#a0a0a0" stroked="f"/>
-        </w:pict>
-      </w:r>
-    </w:p>
-    <w:p>
-      <w:pPr>
-        <w:pStyle w:val="Heading2"/>
-        <w:keepNext w:val="0"/>
-        <w:keepLines w:val="0"/>
-        <w:spacing w:after="80"/>
-        <w:rPr>
-          <w:b/>
-          <w:bCs/>
-          <w:sz w:val="34"/>
-          <w:szCs w:val="34"/>
-        </w:rPr>
-      </w:pPr>
-      <w:bookmarkStart w:id="1" w:name="_nk6eiyipumgb" w:colFirst="0" w:colLast="0"/>
-      <w:bookmarkEnd w:id="1"/>
-      <w:r>
-        <w:rPr>
-          <w:b/>
-          <w:bCs/>
-          <w:sz w:val="34"/>
-          <w:szCs w:val="34"/>
-        </w:rPr>
-        <w:t>2. Engine Posture</w:t>
-      </w:r>
-    </w:p>
-    <w:p>
-      <w:pPr>
-        <w:pStyle w:val="Heading3"/>
-        <w:keepNext w:val="0"/>
-        <w:keepLines w:val="0"/>
-        <w:spacing w:before="280"/>
-        <w:rPr>
-          <w:b/>
-          <w:bCs/>
-          <w:color w:val="000000"/>
-          <w:sz w:val="26"/>
-          <w:szCs w:val="26"/>
-        </w:rPr>
-      </w:pPr>
-      <w:bookmarkStart w:id="2" w:name="_17226ond438t" w:colFirst="0" w:colLast="0"/>
-      <w:bookmarkEnd w:id="2"/>
-      <w:r>
-        <w:rPr>
-          <w:b/>
-          <w:bCs/>
-          <w:color w:val="000000"/>
-          <w:sz w:val="26"/>
-          <w:szCs w:val="26"/>
-        </w:rPr>
-        <w:t>2.1 Deterministic Execution</w:t>
-      </w:r>
-    </w:p>
-    <w:p>
-      <w:pPr>
-        <w:spacing w:before="240" w:after="240"/>
-      </w:pPr>
-      <w:r>
-        <w:t>The engine must be:</w:t>
-      </w:r>
-    </w:p>
-    <w:p>
-      <w:pPr>
-        <w:numPr>
-          <w:ilvl w:val="0"/>
-          <w:numId w:val="7"/>
-        </w:numPr>
-        <w:spacing w:before="240"/>
-      </w:pPr>
-      <w:r>
-        <w:t>deterministic,</w:t>
-      </w:r>
-    </w:p>
-    <w:p>
-      <w:pPr>
-        <w:numPr>
-          <w:ilvl w:val="0"/>
-          <w:numId w:val="7"/>
-        </w:numPr>
-      </w:pPr>
-      <w:proofErr w:type="spellStart"/>
-      <w:r>
-        <w:t>replayable</w:t>
-      </w:r>
-      <w:proofErr w:type="spellEnd"/>
-      <w:r>
-        <w:t>,</w:t>
-      </w:r>
-    </w:p>
-    <w:p>
-      <w:pPr>
-        <w:numPr>
-          <w:ilvl w:val="0"/>
-          <w:numId w:val="7"/>
-        </w:numPr>
-        <w:spacing w:after="240"/>
-      </w:pPr>
-      <w:r>
-        <w:lastRenderedPageBreak/>
-        <w:t>auditable.</w:t>
-      </w:r>
-    </w:p>
-    <w:p>
-      <w:pPr>
-        <w:spacing w:before="240" w:after="240"/>
-      </w:pPr>
-      <w:r>
-        <w:t>Given the same inputs, it must always produce the same outputs or the same failure.</w:t>
-      </w:r>
-    </w:p>
-    <w:p>
-      <w:pPr>
-        <w:spacing w:before="240" w:after="240"/>
-      </w:pPr>
-      <w:r>
-        <w:pict w14:anchorId="7102B026">
-          <v:rect id="_x0000_i1027" style="width:0;height:1.5pt" o:hralign="center" o:hrstd="t" o:hr="t" fillcolor="#a0a0a0" stroked="f"/>
-        </w:pict>
-      </w:r>
-    </w:p>
-    <w:p>
-      <w:pPr>
-        <w:pStyle w:val="Heading3"/>
-        <w:keepNext w:val="0"/>
-        <w:keepLines w:val="0"/>
-        <w:spacing w:before="280"/>
-        <w:rPr>
-          <w:b/>
-          <w:bCs/>
-          <w:color w:val="000000"/>
-          <w:sz w:val="26"/>
-          <w:szCs w:val="26"/>
-        </w:rPr>
-      </w:pPr>
-      <w:bookmarkStart w:id="3" w:name="_iwcwiy5ilrl7" w:colFirst="0" w:colLast="0"/>
-      <w:bookmarkEnd w:id="3"/>
-      <w:r>
-        <w:rPr>
-          <w:b/>
-          <w:bCs/>
-          <w:color w:val="000000"/>
-          <w:sz w:val="26"/>
-          <w:szCs w:val="26"/>
-        </w:rPr>
-        <w:t>2.2 Closed-World Assumption</w:t>
-      </w:r>
-    </w:p>
-    <w:p>
-      <w:pPr>
-        <w:numPr>
-          <w:ilvl w:val="0"/>
-          <w:numId w:val="17"/>
-        </w:numPr>
-        <w:spacing w:before="240"/>
-      </w:pPr>
-      <w:r>
-        <w:t>Kolosseum operates under a closed-world model.</w:t>
-      </w:r>
-    </w:p>
-    <w:p>
-      <w:pPr>
-        <w:numPr>
-          <w:ilvl w:val="0"/>
-          <w:numId w:val="17"/>
-        </w:numPr>
-      </w:pPr>
-      <w:r>
-        <w:t>Only explicitly declared data exists.</w:t>
-      </w:r>
-    </w:p>
-    <w:p>
-      <w:pPr>
-        <w:numPr>
-          <w:ilvl w:val="0"/>
-          <w:numId w:val="17"/>
-        </w:numPr>
-        <w:spacing w:after="240"/>
-      </w:pPr>
-      <w:r>
-        <w:t>Absence is treated as prohibition.</w:t>
-      </w:r>
-    </w:p>
-    <w:p>
-      <w:pPr>
-        <w:spacing w:before="240" w:after="240"/>
-      </w:pPr>
-      <w:r>
-        <w:t>No module may infer missing information.</w:t>
-      </w:r>
-    </w:p>
-    <w:p>
-      <w:pPr>
-        <w:spacing w:before="240" w:after="240"/>
-      </w:pPr>
-      <w:r>
-        <w:pict w14:anchorId="76D0A022">
-          <v:rect id="_x0000_i1028" style="width:0;height:1.5pt" o:hralign="center" o:hrstd="t" o:hr="t" fillcolor="#a0a0a0" stroked="f"/>
-        </w:pict>
-      </w:r>
-    </w:p>
-    <w:p>
-      <w:pPr>
-        <w:pStyle w:val="Heading3"/>
-        <w:keepNext w:val="0"/>
-        <w:keepLines w:val="0"/>
-        <w:spacing w:before="280"/>
-        <w:rPr>
-          <w:b/>
-          <w:bCs/>
-          <w:color w:val="000000"/>
-          <w:sz w:val="26"/>
-          <w:szCs w:val="26"/>
-        </w:rPr>
-      </w:pPr>
-      <w:bookmarkStart w:id="4" w:name="_80sndn7gxqr9" w:colFirst="0" w:colLast="0"/>
-      <w:bookmarkEnd w:id="4"/>
-      <w:r>
-        <w:rPr>
-          <w:b/>
-          <w:bCs/>
-          <w:color w:val="000000"/>
-          <w:sz w:val="26"/>
-          <w:szCs w:val="26"/>
-        </w:rPr>
-        <w:t>2.3 Fail-Closed by Default</w:t>
-      </w:r>
-    </w:p>
-    <w:p>
-      <w:pPr>
-        <w:numPr>
-          <w:ilvl w:val="0"/>
-          <w:numId w:val="3"/>
-        </w:numPr>
-        <w:spacing w:before="240"/>
-      </w:pPr>
-      <w:r>
-        <w:t>Any ambiguity, contradiction, or undeclared dependency results in failure.</w:t>
-      </w:r>
-    </w:p>
-    <w:p>
-      <w:pPr>
-        <w:numPr>
-          <w:ilvl w:val="0"/>
-          <w:numId w:val="3"/>
-        </w:numPr>
-      </w:pPr>
-      <w:r>
-        <w:t>There is no “best effort” mode.</w:t>
-      </w:r>
-    </w:p>
-    <w:p>
-      <w:pPr>
-        <w:numPr>
-          <w:ilvl w:val="0"/>
-          <w:numId w:val="3"/>
-        </w:numPr>
-        <w:spacing w:after="240"/>
-      </w:pPr>
-      <w:r>
-        <w:t>There is no silent degradation.</w:t>
-      </w:r>
-    </w:p>
-    <w:p>
-      <w:pPr>
-        <w:spacing w:before="240" w:after="240"/>
-      </w:pPr>
-      <w:r>
-        <w:pict w14:anchorId="1EE13E6E">
-          <v:rect id="_x0000_i1029" style="width:0;height:1.5pt" o:hralign="center" o:hrstd="t" o:hr="t" fillcolor="#a0a0a0" stroked="f"/>
-        </w:pict>
-      </w:r>
-    </w:p>
-    <w:p>
-      <w:pPr>
-        <w:pStyle w:val="Heading2"/>
-        <w:keepNext w:val="0"/>
-        <w:keepLines w:val="0"/>
-        <w:spacing w:after="80"/>
-        <w:rPr>
-          <w:b/>
-          <w:bCs/>
-          <w:sz w:val="34"/>
-          <w:szCs w:val="34"/>
-        </w:rPr>
-      </w:pPr>
-      <w:bookmarkStart w:id="5" w:name="_t6btc2ud3rvm" w:colFirst="0" w:colLast="0"/>
-      <w:bookmarkEnd w:id="5"/>
-      <w:r>
-        <w:rPr>
-          <w:b/>
-          <w:bCs/>
-          <w:sz w:val="34"/>
-          <w:szCs w:val="34"/>
-        </w:rPr>
-        <w:t>3. Authority Model</w:t>
-      </w:r>
-    </w:p>
-    <w:p>
-      <w:pPr>
-        <w:pStyle w:val="Heading3"/>
-        <w:keepNext w:val="0"/>
-        <w:keepLines w:val="0"/>
-        <w:spacing w:before="280"/>
-        <w:rPr>
-          <w:b/>
-          <w:bCs/>
-          <w:color w:val="000000"/>
-          <w:sz w:val="26"/>
-          <w:szCs w:val="26"/>
-        </w:rPr>
-      </w:pPr>
-      <w:bookmarkStart w:id="6" w:name="_ufg9r81m3jgu" w:colFirst="0" w:colLast="0"/>
-      <w:bookmarkEnd w:id="6"/>
-      <w:r>
-        <w:rPr>
-          <w:b/>
-          <w:bCs/>
-          <w:color w:val="000000"/>
-          <w:sz w:val="26"/>
-          <w:szCs w:val="26"/>
-        </w:rPr>
-        <w:t>3.1 Declaration Authority</w:t>
-      </w:r>
-    </w:p>
-    <w:p>
-      <w:pPr>
-        <w:spacing w:before="240" w:after="240"/>
-      </w:pPr>
-      <w:r>
-        <w:t xml:space="preserve">Authority enters the system </w:t>
-      </w:r>
-      <w:r>
-        <w:rPr>
-          <w:b/>
-          <w:bCs/>
-        </w:rPr>
-        <w:t>only</w:t>
-      </w:r>
-      <w:r>
-        <w:t xml:space="preserve"> through:</w:t>
-      </w:r>
-    </w:p>
-    <w:p>
-      <w:pPr>
-        <w:numPr>
-          <w:ilvl w:val="0"/>
-          <w:numId w:val="8"/>
-        </w:numPr>
-        <w:spacing w:before="240"/>
-      </w:pPr>
-      <w:r>
-        <w:t>Phase 1 declarations,</w:t>
-      </w:r>
-    </w:p>
-    <w:p>
-      <w:pPr>
-        <w:numPr>
-          <w:ilvl w:val="0"/>
-          <w:numId w:val="8"/>
-        </w:numPr>
-      </w:pPr>
-      <w:r>
-        <w:t>Registry-defined schemas,</w:t>
-      </w:r>
-    </w:p>
-    <w:p>
-      <w:pPr>
-        <w:numPr>
-          <w:ilvl w:val="0"/>
-          <w:numId w:val="8"/>
-        </w:numPr>
-        <w:spacing w:after="240"/>
-      </w:pPr>
-      <w:r>
-        <w:t>Explicit template contracts.</w:t>
-      </w:r>
-    </w:p>
-    <w:p>
-      <w:pPr>
-        <w:spacing w:before="240" w:after="240"/>
-      </w:pPr>
-      <w:r>
-        <w:t xml:space="preserve">UI, projections, and downstream consumers have </w:t>
-      </w:r>
-      <w:r>
-        <w:rPr>
-          <w:b/>
-          <w:bCs/>
-        </w:rPr>
-        <w:t>no authority</w:t>
-      </w:r>
-      <w:r>
-        <w:t>.</w:t>
-      </w:r>
-    </w:p>
-    <w:p>
-      <w:pPr>
-        <w:spacing w:before="240" w:after="240"/>
-      </w:pPr>
-      <w:r>
-        <w:pict w14:anchorId="304D24EA">
-          <v:rect id="_x0000_i1030" style="width:0;height:1.5pt" o:hralign="center" o:hrstd="t" o:hr="t" fillcolor="#a0a0a0" stroked="f"/>
-        </w:pict>
-      </w:r>
-    </w:p>
-    <w:p>
-      <w:pPr>
-        <w:pStyle w:val="Heading3"/>
-        <w:keepNext w:val="0"/>
-        <w:keepLines w:val="0"/>
-        <w:spacing w:before="280"/>
-        <w:rPr>
-          <w:b/>
-          <w:bCs/>
-          <w:color w:val="000000"/>
-          <w:sz w:val="26"/>
-          <w:szCs w:val="26"/>
-        </w:rPr>
-      </w:pPr>
-      <w:bookmarkStart w:id="7" w:name="_adki1wap2gwy" w:colFirst="0" w:colLast="0"/>
-      <w:bookmarkEnd w:id="7"/>
-      <w:r>
-        <w:rPr>
-          <w:b/>
-          <w:bCs/>
-          <w:color w:val="000000"/>
-          <w:sz w:val="26"/>
-          <w:szCs w:val="26"/>
-        </w:rPr>
-        <w:t>3.2 Ownership Authority</w:t>
-      </w:r>
-    </w:p>
-    <w:p>
-      <w:pPr>
-        <w:spacing w:before="240" w:after="240"/>
-      </w:pPr>
-      <w:r>
-        <w:t xml:space="preserve">Every executable session has exactly one </w:t>
-      </w:r>
-      <w:r>
-        <w:rPr>
-          <w:b/>
-          <w:bCs/>
-        </w:rPr>
-        <w:t>owner entity</w:t>
-      </w:r>
-      <w:r>
-        <w:t>.</w:t>
-      </w:r>
-    </w:p>
-    <w:p>
-      <w:pPr>
-        <w:spacing w:before="240" w:after="240"/>
-      </w:pPr>
-      <w:r>
-        <w:t>The owner:</w:t>
-      </w:r>
-    </w:p>
-    <w:p>
-      <w:pPr>
-        <w:numPr>
-          <w:ilvl w:val="0"/>
-          <w:numId w:val="20"/>
-        </w:numPr>
-        <w:spacing w:before="240"/>
-      </w:pPr>
-      <w:proofErr w:type="spellStart"/>
-      <w:r>
-        <w:t>authorises</w:t>
-      </w:r>
-      <w:proofErr w:type="spellEnd"/>
-      <w:r>
-        <w:t xml:space="preserve"> execution,</w:t>
-      </w:r>
-    </w:p>
-    <w:p>
-      <w:pPr>
-        <w:numPr>
-          <w:ilvl w:val="0"/>
-          <w:numId w:val="20"/>
-        </w:numPr>
-      </w:pPr>
-      <w:proofErr w:type="gramStart"/>
-      <w:r>
-        <w:lastRenderedPageBreak/>
-        <w:t>carries governance</w:t>
-      </w:r>
-      <w:proofErr w:type="gramEnd"/>
-      <w:r>
-        <w:t xml:space="preserve"> responsibility,</w:t>
-      </w:r>
-    </w:p>
-    <w:p>
-      <w:pPr>
-        <w:numPr>
-          <w:ilvl w:val="0"/>
-          <w:numId w:val="20"/>
-        </w:numPr>
-        <w:spacing w:after="240"/>
-      </w:pPr>
-      <w:r>
-        <w:t>is the root of exclusivity checks.</w:t>
-      </w:r>
-    </w:p>
-    <w:p>
-      <w:pPr>
-        <w:spacing w:before="240" w:after="240"/>
-      </w:pPr>
-      <w:r>
-        <w:t>Ownership is explicit and never inferred.</w:t>
-      </w:r>
-    </w:p>
-    <w:p>
-      <w:pPr>
-        <w:spacing w:before="240" w:after="240"/>
-      </w:pPr>
-      <w:r>
-        <w:pict w14:anchorId="293E0570">
-          <v:rect id="_x0000_i1031" style="width:0;height:1.5pt" o:hralign="center" o:hrstd="t" o:hr="t" fillcolor="#a0a0a0" stroked="f"/>
-        </w:pict>
-      </w:r>
-    </w:p>
-    <w:p>
-      <w:pPr>
-        <w:pStyle w:val="Heading3"/>
-        <w:keepNext w:val="0"/>
-        <w:keepLines w:val="0"/>
-        <w:spacing w:before="280"/>
-        <w:rPr>
-          <w:b/>
-          <w:bCs/>
-          <w:color w:val="000000"/>
-          <w:sz w:val="26"/>
-          <w:szCs w:val="26"/>
-        </w:rPr>
-      </w:pPr>
-      <w:bookmarkStart w:id="8" w:name="_2kbevdqfs2lg" w:colFirst="0" w:colLast="0"/>
-      <w:bookmarkEnd w:id="8"/>
-      <w:r>
-        <w:rPr>
-          <w:b/>
-          <w:bCs/>
-          <w:color w:val="000000"/>
-          <w:sz w:val="26"/>
-          <w:szCs w:val="26"/>
-        </w:rPr>
-        <w:t>3.3 Participation Authority</w:t>
-      </w:r>
-    </w:p>
-    <w:p>
-      <w:pPr>
-        <w:spacing w:before="240" w:after="240"/>
-      </w:pPr>
-      <w:r>
-        <w:t>Participants:</w:t>
-      </w:r>
-    </w:p>
-    <w:p>
-      <w:pPr>
-        <w:numPr>
-          <w:ilvl w:val="0"/>
-          <w:numId w:val="5"/>
-        </w:numPr>
-        <w:spacing w:before="240"/>
-      </w:pPr>
-      <w:r>
-        <w:t>attend sessions,</w:t>
-      </w:r>
-    </w:p>
-    <w:p>
-      <w:pPr>
-        <w:numPr>
-          <w:ilvl w:val="0"/>
-          <w:numId w:val="5"/>
-        </w:numPr>
-      </w:pPr>
-      <w:r>
-        <w:t>do not acquire authority,</w:t>
-      </w:r>
-    </w:p>
-    <w:p>
-      <w:pPr>
-        <w:numPr>
-          <w:ilvl w:val="0"/>
-          <w:numId w:val="5"/>
-        </w:numPr>
-      </w:pPr>
-      <w:r>
-        <w:t>do not override ownership,</w:t>
-      </w:r>
-    </w:p>
-    <w:p>
-      <w:pPr>
-        <w:numPr>
-          <w:ilvl w:val="0"/>
-          <w:numId w:val="5"/>
-        </w:numPr>
-        <w:spacing w:after="240"/>
-      </w:pPr>
-      <w:r>
-        <w:t>do not expand scheduling rights.</w:t>
-      </w:r>
-    </w:p>
-    <w:p>
-      <w:pPr>
-        <w:spacing w:before="240" w:after="240"/>
-      </w:pPr>
-      <w:r>
-        <w:t>Participation is declarative and scoped.</w:t>
-      </w:r>
-    </w:p>
-    <w:p>
-      <w:pPr>
-        <w:spacing w:before="240" w:after="240"/>
-      </w:pPr>
-      <w:r>
-        <w:pict w14:anchorId="21443BB9">
-          <v:rect id="_x0000_i1032" style="width:0;height:1.5pt" o:hralign="center" o:hrstd="t" o:hr="t" fillcolor="#a0a0a0" stroked="f"/>
-        </w:pict>
-      </w:r>
-    </w:p>
-    <w:p>
-      <w:pPr>
-        <w:pStyle w:val="Heading2"/>
-        <w:keepNext w:val="0"/>
-        <w:keepLines w:val="0"/>
-        <w:spacing w:after="80"/>
-        <w:rPr>
-          <w:b/>
-          <w:bCs/>
-          <w:sz w:val="34"/>
-          <w:szCs w:val="34"/>
-        </w:rPr>
-      </w:pPr>
-      <w:bookmarkStart w:id="9" w:name="_av9fwxi2qdrr" w:colFirst="0" w:colLast="0"/>
-      <w:bookmarkEnd w:id="9"/>
-      <w:r>
-        <w:rPr>
-          <w:b/>
-          <w:bCs/>
-          <w:sz w:val="34"/>
-          <w:szCs w:val="34"/>
-        </w:rPr>
-        <w:t>4. Execution Boundaries</w:t>
-      </w:r>
-    </w:p>
-    <w:p>
-      <w:pPr>
-        <w:pStyle w:val="Heading3"/>
-        <w:keepNext w:val="0"/>
-        <w:keepLines w:val="0"/>
-        <w:spacing w:before="280"/>
-        <w:rPr>
-          <w:b/>
-          <w:bCs/>
-          <w:color w:val="000000"/>
-          <w:sz w:val="26"/>
-          <w:szCs w:val="26"/>
-        </w:rPr>
-      </w:pPr>
-      <w:bookmarkStart w:id="10" w:name="_yguwqcyemxtv" w:colFirst="0" w:colLast="0"/>
-      <w:bookmarkEnd w:id="10"/>
-      <w:r>
-        <w:rPr>
-          <w:b/>
-          <w:bCs/>
-          <w:color w:val="000000"/>
-          <w:sz w:val="26"/>
-          <w:szCs w:val="26"/>
-        </w:rPr>
-        <w:t>4.1 What the Engine May Do</w:t>
-      </w:r>
-    </w:p>
-    <w:p>
-      <w:pPr>
-        <w:spacing w:before="240" w:after="240"/>
-      </w:pPr>
-      <w:r>
-        <w:t>The engine may:</w:t>
-      </w:r>
-    </w:p>
-    <w:p>
-      <w:pPr>
-        <w:numPr>
-          <w:ilvl w:val="0"/>
-          <w:numId w:val="21"/>
-        </w:numPr>
-        <w:spacing w:before="240"/>
-      </w:pPr>
-      <w:r>
-        <w:t>validate declarations,</w:t>
-      </w:r>
-    </w:p>
-    <w:p>
-      <w:pPr>
-        <w:numPr>
-          <w:ilvl w:val="0"/>
-          <w:numId w:val="21"/>
-        </w:numPr>
-      </w:pPr>
-      <w:r>
-        <w:t>generate sessions from templates,</w:t>
-      </w:r>
-    </w:p>
-    <w:p>
-      <w:pPr>
-        <w:numPr>
-          <w:ilvl w:val="0"/>
-          <w:numId w:val="21"/>
-        </w:numPr>
-      </w:pPr>
-      <w:r>
-        <w:t>bind sessions to declared slots,</w:t>
-      </w:r>
-    </w:p>
-    <w:p>
-      <w:pPr>
-        <w:numPr>
-          <w:ilvl w:val="0"/>
-          <w:numId w:val="21"/>
-        </w:numPr>
-      </w:pPr>
-      <w:r>
-        <w:t>enforce hierarchy-aware exclusivity,</w:t>
-      </w:r>
-    </w:p>
-    <w:p>
-      <w:pPr>
-        <w:numPr>
-          <w:ilvl w:val="0"/>
-          <w:numId w:val="21"/>
-        </w:numPr>
-      </w:pPr>
-      <w:r>
-        <w:t>emit deterministic program artefacts,</w:t>
-      </w:r>
-    </w:p>
-    <w:p>
-      <w:pPr>
-        <w:numPr>
-          <w:ilvl w:val="0"/>
-          <w:numId w:val="21"/>
-        </w:numPr>
-        <w:spacing w:after="240"/>
-      </w:pPr>
-      <w:r>
-        <w:t>fail compilation with authoritative tokens.</w:t>
-      </w:r>
-    </w:p>
-    <w:p>
-      <w:pPr>
-        <w:spacing w:before="240" w:after="240"/>
-      </w:pPr>
-      <w:r>
-        <w:pict w14:anchorId="7D08A5E8">
-          <v:rect id="_x0000_i1033" style="width:0;height:1.5pt" o:hralign="center" o:hrstd="t" o:hr="t" fillcolor="#a0a0a0" stroked="f"/>
-        </w:pict>
-      </w:r>
-    </w:p>
-    <w:p>
-      <w:pPr>
-        <w:pStyle w:val="Heading3"/>
-        <w:keepNext w:val="0"/>
-        <w:keepLines w:val="0"/>
-        <w:spacing w:before="280"/>
-        <w:rPr>
-          <w:b/>
-          <w:bCs/>
-          <w:color w:val="000000"/>
-          <w:sz w:val="26"/>
-          <w:szCs w:val="26"/>
-        </w:rPr>
-      </w:pPr>
-      <w:bookmarkStart w:id="11" w:name="_qefnvp1112iu" w:colFirst="0" w:colLast="0"/>
-      <w:bookmarkEnd w:id="11"/>
-      <w:r>
-        <w:rPr>
-          <w:b/>
-          <w:bCs/>
-          <w:color w:val="000000"/>
-          <w:sz w:val="26"/>
-          <w:szCs w:val="26"/>
-        </w:rPr>
-        <w:t>4.2 What the Engine Must Never Do</w:t>
-      </w:r>
-    </w:p>
-    <w:p>
-      <w:pPr>
-        <w:spacing w:before="240" w:after="240"/>
-      </w:pPr>
-      <w:r>
-        <w:t>The engine must never:</w:t>
-      </w:r>
-    </w:p>
-    <w:p>
-      <w:pPr>
-        <w:numPr>
-          <w:ilvl w:val="0"/>
-          <w:numId w:val="12"/>
-        </w:numPr>
-        <w:spacing w:before="240"/>
-      </w:pPr>
-      <w:r>
-        <w:t>infer schedules or availability,</w:t>
-      </w:r>
-    </w:p>
-    <w:p>
-      <w:pPr>
-        <w:numPr>
-          <w:ilvl w:val="0"/>
-          <w:numId w:val="12"/>
-        </w:numPr>
-      </w:pPr>
-      <w:r>
-        <w:t>auto-assign sessions to slots,</w:t>
-      </w:r>
-    </w:p>
-    <w:p>
-      <w:pPr>
-        <w:numPr>
-          <w:ilvl w:val="0"/>
-          <w:numId w:val="12"/>
-        </w:numPr>
-      </w:pPr>
-      <w:r>
-        <w:t>rebalance groups,</w:t>
-      </w:r>
-    </w:p>
-    <w:p>
-      <w:pPr>
-        <w:numPr>
-          <w:ilvl w:val="0"/>
-          <w:numId w:val="12"/>
-        </w:numPr>
-      </w:pPr>
-      <w:r>
-        <w:t>split or merge entities,</w:t>
-      </w:r>
-    </w:p>
-    <w:p>
-      <w:pPr>
-        <w:numPr>
-          <w:ilvl w:val="0"/>
-          <w:numId w:val="12"/>
-        </w:numPr>
-      </w:pPr>
-      <w:r>
-        <w:t>infer partial participation,</w:t>
-      </w:r>
-    </w:p>
-    <w:p>
-      <w:pPr>
-        <w:numPr>
-          <w:ilvl w:val="0"/>
-          <w:numId w:val="12"/>
-        </w:numPr>
-      </w:pPr>
-      <w:proofErr w:type="spellStart"/>
-      <w:r>
-        <w:t>optimise</w:t>
-      </w:r>
-      <w:proofErr w:type="spellEnd"/>
-      <w:r>
-        <w:t xml:space="preserve"> or “fix” conflicts,</w:t>
-      </w:r>
-    </w:p>
-    <w:p>
-      <w:pPr>
-        <w:numPr>
-          <w:ilvl w:val="0"/>
-          <w:numId w:val="12"/>
-        </w:numPr>
-        <w:spacing w:after="240"/>
-      </w:pPr>
-      <w:r>
-        <w:lastRenderedPageBreak/>
-        <w:t>silently drop illegal elements.</w:t>
-      </w:r>
-    </w:p>
-    <w:p>
-      <w:pPr>
-        <w:spacing w:before="240" w:after="240"/>
-      </w:pPr>
-      <w:r>
-        <w:pict w14:anchorId="0C1A88E5">
-          <v:rect id="_x0000_i1034" style="width:0;height:1.5pt" o:hralign="center" o:hrstd="t" o:hr="t" fillcolor="#a0a0a0" stroked="f"/>
-        </w:pict>
-      </w:r>
-    </w:p>
-    <w:p>
-      <w:pPr>
-        <w:pStyle w:val="Heading2"/>
-        <w:keepNext w:val="0"/>
-        <w:keepLines w:val="0"/>
-        <w:spacing w:after="80"/>
-        <w:rPr>
-          <w:b/>
-          <w:bCs/>
-          <w:sz w:val="34"/>
-          <w:szCs w:val="34"/>
-        </w:rPr>
-      </w:pPr>
-      <w:bookmarkStart w:id="12" w:name="_xs9q9inijwnn" w:colFirst="0" w:colLast="0"/>
-      <w:bookmarkEnd w:id="12"/>
-      <w:r>
-        <w:rPr>
-          <w:b/>
-          <w:bCs/>
-          <w:sz w:val="34"/>
-          <w:szCs w:val="34"/>
-        </w:rPr>
-        <w:t>5. Scheduling Law (Anchoring)</w:t>
-      </w:r>
-    </w:p>
-    <w:p>
-      <w:pPr>
-        <w:pStyle w:val="Heading3"/>
-        <w:keepNext w:val="0"/>
-        <w:keepLines w:val="0"/>
-        <w:spacing w:before="280"/>
-        <w:rPr>
-          <w:b/>
-          <w:bCs/>
-          <w:color w:val="000000"/>
-          <w:sz w:val="26"/>
-          <w:szCs w:val="26"/>
-        </w:rPr>
-      </w:pPr>
-      <w:bookmarkStart w:id="13" w:name="_ttv5169xlw5i" w:colFirst="0" w:colLast="0"/>
-      <w:bookmarkEnd w:id="13"/>
-      <w:r>
-        <w:rPr>
-          <w:b/>
-          <w:bCs/>
-          <w:color w:val="000000"/>
-          <w:sz w:val="26"/>
-          <w:szCs w:val="26"/>
-        </w:rPr>
-        <w:t>5.1 Slot-Based Time Occupancy</w:t>
-      </w:r>
-    </w:p>
-    <w:p>
-      <w:pPr>
-        <w:numPr>
-          <w:ilvl w:val="0"/>
-          <w:numId w:val="1"/>
-        </w:numPr>
-        <w:spacing w:before="240"/>
-      </w:pPr>
-      <w:r>
-        <w:t xml:space="preserve">Time is represented </w:t>
-      </w:r>
-      <w:r>
-        <w:rPr>
-          <w:b/>
-          <w:bCs/>
-        </w:rPr>
-        <w:t>only</w:t>
-      </w:r>
-      <w:r>
-        <w:t xml:space="preserve"> via declared time slots.</w:t>
-      </w:r>
-    </w:p>
-    <w:p>
-      <w:pPr>
-        <w:numPr>
-          <w:ilvl w:val="0"/>
-          <w:numId w:val="1"/>
-        </w:numPr>
-      </w:pPr>
-      <w:r>
-        <w:t>Slot binding is the sole source of time occupancy.</w:t>
-      </w:r>
-    </w:p>
-    <w:p>
-      <w:pPr>
-        <w:numPr>
-          <w:ilvl w:val="0"/>
-          <w:numId w:val="1"/>
-        </w:numPr>
-        <w:spacing w:after="240"/>
-      </w:pPr>
-      <w:r>
-        <w:t>A slot may be bound to at most one session.</w:t>
-      </w:r>
-    </w:p>
-    <w:p>
-      <w:pPr>
-        <w:spacing w:before="240" w:after="240"/>
-      </w:pPr>
-      <w:r>
-        <w:pict w14:anchorId="6BFEC6D8">
-          <v:rect id="_x0000_i1035" style="width:0;height:1.5pt" o:hralign="center" o:hrstd="t" o:hr="t" fillcolor="#a0a0a0" stroked="f"/>
-        </w:pict>
-      </w:r>
-    </w:p>
-    <w:p>
-      <w:pPr>
-        <w:pStyle w:val="Heading3"/>
-        <w:keepNext w:val="0"/>
-        <w:keepLines w:val="0"/>
-        <w:spacing w:before="280"/>
-        <w:rPr>
-          <w:b/>
-          <w:bCs/>
-          <w:color w:val="000000"/>
-          <w:sz w:val="26"/>
-          <w:szCs w:val="26"/>
-        </w:rPr>
-      </w:pPr>
-      <w:bookmarkStart w:id="14" w:name="_n45mkvpbcopv" w:colFirst="0" w:colLast="0"/>
-      <w:bookmarkEnd w:id="14"/>
-      <w:r>
-        <w:rPr>
-          <w:b/>
-          <w:bCs/>
-          <w:color w:val="000000"/>
-          <w:sz w:val="26"/>
-          <w:szCs w:val="26"/>
-        </w:rPr>
-        <w:t>5.2 Concurrency (A1 Lock)</w:t>
-      </w:r>
-    </w:p>
-    <w:p>
-      <w:pPr>
-        <w:numPr>
-          <w:ilvl w:val="0"/>
-          <w:numId w:val="6"/>
-        </w:numPr>
-        <w:spacing w:before="240"/>
-      </w:pPr>
-      <w:r>
-        <w:t xml:space="preserve">Concurrency exists only via multiple distinct </w:t>
-      </w:r>
-      <w:proofErr w:type="spellStart"/>
-      <w:r>
-        <w:t>slot_ids</w:t>
-      </w:r>
-      <w:proofErr w:type="spellEnd"/>
-      <w:r>
-        <w:t>.</w:t>
-      </w:r>
-    </w:p>
-    <w:p>
-      <w:pPr>
-        <w:numPr>
-          <w:ilvl w:val="0"/>
-          <w:numId w:val="6"/>
-        </w:numPr>
-      </w:pPr>
-      <w:r>
-        <w:t>Shared slots, capacity models, or time arithmetic are forbidden.</w:t>
-      </w:r>
-    </w:p>
-    <w:p>
-      <w:pPr>
-        <w:numPr>
-          <w:ilvl w:val="0"/>
-          <w:numId w:val="6"/>
-        </w:numPr>
-        <w:spacing w:after="240"/>
-      </w:pPr>
-      <w:r>
-        <w:t>Slots that share clock time are independent only if their identifiers differ.</w:t>
-      </w:r>
-    </w:p>
-    <w:p>
-      <w:pPr>
-        <w:spacing w:before="240" w:after="240"/>
-      </w:pPr>
-      <w:r>
-        <w:pict w14:anchorId="1736B897">
-          <v:rect id="_x0000_i1036" style="width:0;height:1.5pt" o:hralign="center" o:hrstd="t" o:hr="t" fillcolor="#a0a0a0" stroked="f"/>
-        </w:pict>
-      </w:r>
-    </w:p>
-    <w:p>
-      <w:pPr>
-        <w:pStyle w:val="Heading2"/>
-        <w:keepNext w:val="0"/>
-        <w:keepLines w:val="0"/>
-        <w:spacing w:after="80"/>
-        <w:rPr>
-          <w:b/>
-          <w:bCs/>
-          <w:sz w:val="34"/>
-          <w:szCs w:val="34"/>
-        </w:rPr>
-      </w:pPr>
-      <w:bookmarkStart w:id="15" w:name="_iv81up5u8pok" w:colFirst="0" w:colLast="0"/>
-      <w:bookmarkEnd w:id="15"/>
-      <w:r>
-        <w:rPr>
-          <w:b/>
-          <w:bCs/>
-          <w:sz w:val="34"/>
-          <w:szCs w:val="34"/>
-        </w:rPr>
-        <w:t>6. Hierarchy &amp; Exclusivity Law</w:t>
-      </w:r>
-    </w:p>
-    <w:p>
-      <w:pPr>
-        <w:pStyle w:val="Heading3"/>
-        <w:keepNext w:val="0"/>
-        <w:keepLines w:val="0"/>
-        <w:spacing w:before="280"/>
-        <w:rPr>
-          <w:b/>
-          <w:bCs/>
-          <w:color w:val="000000"/>
-          <w:sz w:val="26"/>
-          <w:szCs w:val="26"/>
-        </w:rPr>
-      </w:pPr>
-      <w:bookmarkStart w:id="16" w:name="_iblk0urefv4i" w:colFirst="0" w:colLast="0"/>
-      <w:bookmarkEnd w:id="16"/>
-      <w:r>
-        <w:rPr>
-          <w:b/>
-          <w:bCs/>
-          <w:color w:val="000000"/>
-          <w:sz w:val="26"/>
-          <w:szCs w:val="26"/>
-        </w:rPr>
-        <w:t>6.1 Hierarchy as Fact</w:t>
-      </w:r>
-    </w:p>
-    <w:p>
-      <w:pPr>
-        <w:numPr>
-          <w:ilvl w:val="0"/>
-          <w:numId w:val="15"/>
-        </w:numPr>
-        <w:spacing w:before="240"/>
-      </w:pPr>
-      <w:r>
-        <w:t xml:space="preserve">Entity hierarchies are consumed as authoritative </w:t>
-      </w:r>
-      <w:proofErr w:type="gramStart"/>
-      <w:r>
-        <w:t>fact</w:t>
-      </w:r>
-      <w:proofErr w:type="gramEnd"/>
-      <w:r>
-        <w:t>.</w:t>
-      </w:r>
-    </w:p>
-    <w:p>
-      <w:pPr>
-        <w:numPr>
-          <w:ilvl w:val="0"/>
-          <w:numId w:val="15"/>
-        </w:numPr>
-      </w:pPr>
-      <w:r>
-        <w:t>The engine must not infer hierarchy completeness.</w:t>
-      </w:r>
-    </w:p>
-    <w:p>
-      <w:pPr>
-        <w:numPr>
-          <w:ilvl w:val="0"/>
-          <w:numId w:val="15"/>
-        </w:numPr>
-        <w:spacing w:after="240"/>
-      </w:pPr>
-      <w:r>
-        <w:t>The engine must not repair hierarchy inconsistencies.</w:t>
-      </w:r>
-    </w:p>
-    <w:p>
-      <w:pPr>
-        <w:spacing w:before="240" w:after="240"/>
-      </w:pPr>
-      <w:r>
-        <w:pict w14:anchorId="51FAAB85">
-          <v:rect id="_x0000_i1037" style="width:0;height:1.5pt" o:hralign="center" o:hrstd="t" o:hr="t" fillcolor="#a0a0a0" stroked="f"/>
-        </w:pict>
-      </w:r>
-    </w:p>
-    <w:p>
-      <w:pPr>
-        <w:pStyle w:val="Heading3"/>
-        <w:keepNext w:val="0"/>
-        <w:keepLines w:val="0"/>
-        <w:spacing w:before="280"/>
-        <w:rPr>
-          <w:b/>
-          <w:bCs/>
-          <w:color w:val="000000"/>
-          <w:sz w:val="26"/>
-          <w:szCs w:val="26"/>
-        </w:rPr>
-      </w:pPr>
-      <w:bookmarkStart w:id="17" w:name="_pokmxf1o4qqk" w:colFirst="0" w:colLast="0"/>
-      <w:bookmarkEnd w:id="17"/>
-      <w:r>
-        <w:rPr>
-          <w:b/>
-          <w:bCs/>
-          <w:color w:val="000000"/>
-          <w:sz w:val="26"/>
-          <w:szCs w:val="26"/>
-        </w:rPr>
-        <w:t>6.2 Exclusivity Invariant</w:t>
-      </w:r>
-    </w:p>
-    <w:p>
-      <w:pPr>
-        <w:spacing w:before="240" w:after="240"/>
-      </w:pPr>
-      <w:r>
-        <w:t>At any given time window:</w:t>
-      </w:r>
-    </w:p>
-    <w:p>
-      <w:pPr>
-        <w:spacing w:before="240" w:after="240"/>
-        <w:ind w:left="600" w:right="600"/>
-      </w:pPr>
-      <w:r>
-        <w:t>No entity may be involved in more than one session, directly or implicitly.</w:t>
-      </w:r>
-    </w:p>
-    <w:p>
-      <w:pPr>
-        <w:spacing w:before="240" w:after="240"/>
-      </w:pPr>
-      <w:r>
-        <w:t>This applies to:</w:t>
-      </w:r>
-    </w:p>
-    <w:p>
-      <w:pPr>
-        <w:numPr>
-          <w:ilvl w:val="0"/>
-          <w:numId w:val="19"/>
-        </w:numPr>
-        <w:spacing w:before="240"/>
-      </w:pPr>
-      <w:r>
-        <w:t>athletes,</w:t>
-      </w:r>
-    </w:p>
-    <w:p>
-      <w:pPr>
-        <w:numPr>
-          <w:ilvl w:val="0"/>
-          <w:numId w:val="19"/>
-        </w:numPr>
-      </w:pPr>
-      <w:proofErr w:type="spellStart"/>
-      <w:r>
-        <w:t>subteams</w:t>
-      </w:r>
-      <w:proofErr w:type="spellEnd"/>
-      <w:r>
-        <w:t>,</w:t>
-      </w:r>
-    </w:p>
-    <w:p>
-      <w:pPr>
-        <w:numPr>
-          <w:ilvl w:val="0"/>
-          <w:numId w:val="19"/>
-        </w:numPr>
-      </w:pPr>
-      <w:r>
-        <w:t>teams,</w:t>
-      </w:r>
-    </w:p>
-    <w:p>
-      <w:pPr>
-        <w:numPr>
-          <w:ilvl w:val="0"/>
-          <w:numId w:val="19"/>
-        </w:numPr>
-      </w:pPr>
-      <w:r>
-        <w:t>units,</w:t>
-      </w:r>
-    </w:p>
-    <w:p>
-      <w:pPr>
-        <w:numPr>
-          <w:ilvl w:val="0"/>
-          <w:numId w:val="19"/>
-        </w:numPr>
-        <w:spacing w:after="240"/>
-      </w:pPr>
-      <w:proofErr w:type="spellStart"/>
-      <w:r>
-        <w:lastRenderedPageBreak/>
-        <w:t>organisations</w:t>
-      </w:r>
-      <w:proofErr w:type="spellEnd"/>
-      <w:r>
-        <w:t>.</w:t>
-      </w:r>
-    </w:p>
-    <w:p>
-      <w:pPr>
-        <w:spacing w:before="240" w:after="240"/>
-      </w:pPr>
-      <w:r>
-        <w:pict w14:anchorId="1763B194">
-          <v:rect id="_x0000_i1038" style="width:0;height:1.5pt" o:hralign="center" o:hrstd="t" o:hr="t" fillcolor="#a0a0a0" stroked="f"/>
-        </w:pict>
-      </w:r>
-    </w:p>
-    <w:p>
-      <w:pPr>
-        <w:pStyle w:val="Heading3"/>
-        <w:keepNext w:val="0"/>
-        <w:keepLines w:val="0"/>
-        <w:spacing w:before="280"/>
-        <w:rPr>
-          <w:b/>
-          <w:bCs/>
-          <w:color w:val="000000"/>
-          <w:sz w:val="26"/>
-          <w:szCs w:val="26"/>
-        </w:rPr>
-      </w:pPr>
-      <w:bookmarkStart w:id="18" w:name="_tyvwlwnyzk0j" w:colFirst="0" w:colLast="0"/>
-      <w:bookmarkEnd w:id="18"/>
-      <w:r>
-        <w:rPr>
-          <w:b/>
-          <w:bCs/>
-          <w:color w:val="000000"/>
-          <w:sz w:val="26"/>
-          <w:szCs w:val="26"/>
-        </w:rPr>
-        <w:t>6.3 Decomposition Requirement</w:t>
-      </w:r>
-    </w:p>
-    <w:p>
-      <w:pPr>
-        <w:spacing w:before="240" w:after="240"/>
-      </w:pPr>
-      <w:r>
-        <w:t xml:space="preserve">Parallel execution within a hierarchy is legal </w:t>
-      </w:r>
-      <w:r>
-        <w:rPr>
-          <w:b/>
-          <w:bCs/>
-        </w:rPr>
-        <w:t>only if</w:t>
-      </w:r>
-      <w:r>
-        <w:t>:</w:t>
-      </w:r>
-    </w:p>
-    <w:p>
-      <w:pPr>
-        <w:numPr>
-          <w:ilvl w:val="0"/>
-          <w:numId w:val="4"/>
-        </w:numPr>
-        <w:spacing w:before="240"/>
-      </w:pPr>
-      <w:r>
-        <w:t>the parent entity does not participate, and</w:t>
-      </w:r>
-    </w:p>
-    <w:p>
-      <w:pPr>
-        <w:numPr>
-          <w:ilvl w:val="0"/>
-          <w:numId w:val="4"/>
-        </w:numPr>
-      </w:pPr>
-      <w:r>
-        <w:t>child entities are explicitly declared, and</w:t>
-      </w:r>
-    </w:p>
-    <w:p>
-      <w:pPr>
-        <w:numPr>
-          <w:ilvl w:val="0"/>
-          <w:numId w:val="4"/>
-        </w:numPr>
-        <w:spacing w:after="240"/>
-      </w:pPr>
-      <w:r>
-        <w:t>child sets are disjoint.</w:t>
-      </w:r>
-    </w:p>
-    <w:p>
-      <w:pPr>
-        <w:spacing w:before="240" w:after="240"/>
-      </w:pPr>
-      <w:r>
-        <w:pict w14:anchorId="6341C61F">
-          <v:rect id="_x0000_i1039" style="width:0;height:1.5pt" o:hralign="center" o:hrstd="t" o:hr="t" fillcolor="#a0a0a0" stroked="f"/>
-        </w:pict>
-      </w:r>
-    </w:p>
-    <w:p>
-      <w:pPr>
-        <w:pStyle w:val="Heading2"/>
-        <w:keepNext w:val="0"/>
-        <w:keepLines w:val="0"/>
-        <w:spacing w:after="80"/>
-        <w:rPr>
-          <w:b/>
-          <w:bCs/>
-          <w:sz w:val="34"/>
-          <w:szCs w:val="34"/>
-        </w:rPr>
-      </w:pPr>
-      <w:bookmarkStart w:id="19" w:name="_2oq1733py7kf" w:colFirst="0" w:colLast="0"/>
-      <w:bookmarkEnd w:id="19"/>
-      <w:r>
-        <w:rPr>
-          <w:b/>
-          <w:bCs/>
-          <w:sz w:val="34"/>
-          <w:szCs w:val="34"/>
-        </w:rPr>
-        <w:t>7. Execution Validity</w:t>
-      </w:r>
-    </w:p>
-    <w:p>
-      <w:pPr>
-        <w:pStyle w:val="Heading3"/>
-        <w:keepNext w:val="0"/>
-        <w:keepLines w:val="0"/>
-        <w:spacing w:before="280"/>
-        <w:rPr>
-          <w:b/>
-          <w:bCs/>
-          <w:color w:val="000000"/>
-          <w:sz w:val="26"/>
-          <w:szCs w:val="26"/>
-        </w:rPr>
-      </w:pPr>
-      <w:bookmarkStart w:id="20" w:name="_mskg0q2bztsp" w:colFirst="0" w:colLast="0"/>
-      <w:bookmarkEnd w:id="20"/>
-      <w:r>
-        <w:rPr>
-          <w:b/>
-          <w:bCs/>
-          <w:color w:val="000000"/>
-          <w:sz w:val="26"/>
-          <w:szCs w:val="26"/>
-        </w:rPr>
-        <w:t>7.1 Valid Program Definition</w:t>
-      </w:r>
-    </w:p>
-    <w:p>
-      <w:pPr>
-        <w:spacing w:before="240" w:after="240"/>
-      </w:pPr>
-      <w:r>
-        <w:t>A program is valid if and only if:</w:t>
-      </w:r>
-    </w:p>
-    <w:p>
-      <w:pPr>
-        <w:numPr>
-          <w:ilvl w:val="0"/>
-          <w:numId w:val="11"/>
-        </w:numPr>
-        <w:spacing w:before="240"/>
-      </w:pPr>
-      <w:r>
-        <w:t>all required declarations exist,</w:t>
-      </w:r>
-    </w:p>
-    <w:p>
-      <w:pPr>
-        <w:numPr>
-          <w:ilvl w:val="0"/>
-          <w:numId w:val="11"/>
-        </w:numPr>
-      </w:pPr>
-      <w:r>
-        <w:t>all schema rules pass,</w:t>
-      </w:r>
-    </w:p>
-    <w:p>
-      <w:pPr>
-        <w:numPr>
-          <w:ilvl w:val="0"/>
-          <w:numId w:val="11"/>
-        </w:numPr>
-      </w:pPr>
-      <w:r>
-        <w:t>all registry constraints pass,</w:t>
-      </w:r>
-    </w:p>
-    <w:p>
-      <w:pPr>
-        <w:numPr>
-          <w:ilvl w:val="0"/>
-          <w:numId w:val="11"/>
-        </w:numPr>
-      </w:pPr>
-      <w:r>
-        <w:t>all hierarchy exclusivity rules pass,</w:t>
-      </w:r>
-    </w:p>
-    <w:p>
-      <w:pPr>
-        <w:numPr>
-          <w:ilvl w:val="0"/>
-          <w:numId w:val="11"/>
-        </w:numPr>
-        <w:spacing w:after="240"/>
-      </w:pPr>
-      <w:proofErr w:type="gramStart"/>
-      <w:r>
-        <w:t>no</w:t>
-      </w:r>
-      <w:proofErr w:type="gramEnd"/>
-      <w:r>
-        <w:t xml:space="preserve"> forbidden inference is required.</w:t>
-      </w:r>
-    </w:p>
-    <w:p>
-      <w:pPr>
-        <w:spacing w:before="240" w:after="240"/>
-      </w:pPr>
-      <w:r>
-        <w:pict w14:anchorId="3579A1EC">
-          <v:rect id="_x0000_i1040" style="width:0;height:1.5pt" o:hralign="center" o:hrstd="t" o:hr="t" fillcolor="#a0a0a0" stroked="f"/>
-        </w:pict>
-      </w:r>
-    </w:p>
-    <w:p>
-      <w:pPr>
-        <w:pStyle w:val="Heading3"/>
-        <w:keepNext w:val="0"/>
-        <w:keepLines w:val="0"/>
-        <w:spacing w:before="280"/>
-        <w:rPr>
-          <w:b/>
-          <w:bCs/>
-          <w:color w:val="000000"/>
-          <w:sz w:val="26"/>
-          <w:szCs w:val="26"/>
-        </w:rPr>
-      </w:pPr>
-      <w:bookmarkStart w:id="21" w:name="_7hc9q3mf8njg" w:colFirst="0" w:colLast="0"/>
-      <w:bookmarkEnd w:id="21"/>
-      <w:r>
-        <w:rPr>
-          <w:b/>
-          <w:bCs/>
-          <w:color w:val="000000"/>
-          <w:sz w:val="26"/>
-          <w:szCs w:val="26"/>
-        </w:rPr>
-        <w:t>7.2 Invalid Program Handling</w:t>
-      </w:r>
-    </w:p>
-    <w:p>
-      <w:pPr>
-        <w:spacing w:before="240" w:after="240"/>
-      </w:pPr>
-      <w:r>
-        <w:t>If a program is invalid:</w:t>
-      </w:r>
-    </w:p>
-    <w:p>
-      <w:pPr>
-        <w:numPr>
-          <w:ilvl w:val="0"/>
-          <w:numId w:val="10"/>
-        </w:numPr>
-        <w:spacing w:before="240"/>
-      </w:pPr>
-      <w:r>
-        <w:t>no partial output is emitted,</w:t>
-      </w:r>
-    </w:p>
-    <w:p>
-      <w:pPr>
-        <w:numPr>
-          <w:ilvl w:val="0"/>
-          <w:numId w:val="10"/>
-        </w:numPr>
-      </w:pPr>
-      <w:r>
-        <w:t>no sessions are executable,</w:t>
-      </w:r>
-    </w:p>
-    <w:p>
-      <w:pPr>
-        <w:numPr>
-          <w:ilvl w:val="0"/>
-          <w:numId w:val="10"/>
-        </w:numPr>
-        <w:spacing w:after="240"/>
-      </w:pPr>
-      <w:r>
-        <w:t>a failure token is returned.</w:t>
-      </w:r>
-    </w:p>
-    <w:p>
-      <w:pPr>
-        <w:spacing w:before="240" w:after="240"/>
-      </w:pPr>
-      <w:r>
-        <w:t>There is no degraded execution path.</w:t>
-      </w:r>
-    </w:p>
-    <w:p>
-      <w:pPr>
-        <w:spacing w:before="240" w:after="240"/>
-      </w:pPr>
-      <w:r>
-        <w:pict w14:anchorId="19D10979">
-          <v:rect id="_x0000_i1041" style="width:0;height:1.5pt" o:hralign="center" o:hrstd="t" o:hr="t" fillcolor="#a0a0a0" stroked="f"/>
-        </w:pict>
-      </w:r>
-    </w:p>
-    <w:p>
-      <w:pPr>
-        <w:pStyle w:val="Heading2"/>
-        <w:keepNext w:val="0"/>
-        <w:keepLines w:val="0"/>
-        <w:spacing w:after="80"/>
-        <w:rPr>
-          <w:b/>
-          <w:bCs/>
-          <w:sz w:val="34"/>
-          <w:szCs w:val="34"/>
-        </w:rPr>
-      </w:pPr>
-      <w:bookmarkStart w:id="22" w:name="_77sc6wkjubzy" w:colFirst="0" w:colLast="0"/>
-      <w:bookmarkEnd w:id="22"/>
-      <w:r>
-        <w:rPr>
-          <w:b/>
-          <w:bCs/>
-          <w:sz w:val="34"/>
-          <w:szCs w:val="34"/>
-        </w:rPr>
-        <w:t>8. Audit &amp; Replay</w:t>
-      </w:r>
-    </w:p>
-    <w:p>
-      <w:pPr>
-        <w:pStyle w:val="Heading3"/>
-        <w:keepNext w:val="0"/>
-        <w:keepLines w:val="0"/>
-        <w:spacing w:before="280"/>
-        <w:rPr>
-          <w:b/>
-          <w:bCs/>
-          <w:color w:val="000000"/>
-          <w:sz w:val="26"/>
-          <w:szCs w:val="26"/>
-        </w:rPr>
-      </w:pPr>
-      <w:bookmarkStart w:id="23" w:name="_rtmkm7b7ofuo" w:colFirst="0" w:colLast="0"/>
-      <w:bookmarkEnd w:id="23"/>
-      <w:r>
-        <w:rPr>
-          <w:b/>
-          <w:bCs/>
-          <w:color w:val="000000"/>
-          <w:sz w:val="26"/>
-          <w:szCs w:val="26"/>
-        </w:rPr>
-        <w:t>8.1 Auditability</w:t>
-      </w:r>
-    </w:p>
-    <w:p>
-      <w:pPr>
-        <w:spacing w:before="240" w:after="240"/>
-      </w:pPr>
-      <w:r>
-        <w:lastRenderedPageBreak/>
-        <w:t>All execution must be:</w:t>
-      </w:r>
-    </w:p>
-    <w:p>
-      <w:pPr>
-        <w:numPr>
-          <w:ilvl w:val="0"/>
-          <w:numId w:val="14"/>
-        </w:numPr>
-        <w:spacing w:before="240"/>
-      </w:pPr>
-      <w:r>
-        <w:t>traceable to source declarations,</w:t>
-      </w:r>
-    </w:p>
-    <w:p>
-      <w:pPr>
-        <w:numPr>
-          <w:ilvl w:val="0"/>
-          <w:numId w:val="14"/>
-        </w:numPr>
-      </w:pPr>
-      <w:r>
-        <w:t>traceable to registry versions,</w:t>
-      </w:r>
-    </w:p>
-    <w:p>
-      <w:pPr>
-        <w:numPr>
-          <w:ilvl w:val="0"/>
-          <w:numId w:val="14"/>
-        </w:numPr>
-        <w:spacing w:after="240"/>
-      </w:pPr>
-      <w:r>
-        <w:t>traceable to engine version.</w:t>
-      </w:r>
-    </w:p>
-    <w:p>
-      <w:pPr>
-        <w:spacing w:before="240" w:after="240"/>
-      </w:pPr>
-      <w:r>
-        <w:pict w14:anchorId="35712012">
-          <v:rect id="_x0000_i1042" style="width:0;height:1.5pt" o:hralign="center" o:hrstd="t" o:hr="t" fillcolor="#a0a0a0" stroked="f"/>
-        </w:pict>
-      </w:r>
-    </w:p>
-    <w:p>
-      <w:pPr>
-        <w:pStyle w:val="Heading3"/>
-        <w:keepNext w:val="0"/>
-        <w:keepLines w:val="0"/>
-        <w:spacing w:before="280"/>
-        <w:rPr>
-          <w:b/>
-          <w:bCs/>
-          <w:color w:val="000000"/>
-          <w:sz w:val="26"/>
-          <w:szCs w:val="26"/>
-        </w:rPr>
-      </w:pPr>
-      <w:bookmarkStart w:id="24" w:name="_yq0ynbk3jk09" w:colFirst="0" w:colLast="0"/>
-      <w:bookmarkEnd w:id="24"/>
-      <w:r>
-        <w:rPr>
-          <w:b/>
-          <w:bCs/>
-          <w:color w:val="000000"/>
-          <w:sz w:val="26"/>
-          <w:szCs w:val="26"/>
-        </w:rPr>
-        <w:t xml:space="preserve">8.2 </w:t>
-      </w:r>
-      <w:proofErr w:type="spellStart"/>
-      <w:r>
-        <w:rPr>
-          <w:b/>
-          <w:bCs/>
-          <w:color w:val="000000"/>
-          <w:sz w:val="26"/>
-          <w:szCs w:val="26"/>
-        </w:rPr>
-        <w:t>Replayability</w:t>
-      </w:r>
-      <w:proofErr w:type="spellEnd"/>
-    </w:p>
-    <w:p>
-      <w:pPr>
-        <w:spacing w:before="240" w:after="240"/>
-      </w:pPr>
-      <w:r>
-        <w:t>Given:</w:t>
-      </w:r>
-    </w:p>
-    <w:p>
-      <w:pPr>
-        <w:numPr>
-          <w:ilvl w:val="0"/>
-          <w:numId w:val="13"/>
-        </w:numPr>
-        <w:spacing w:before="240"/>
-      </w:pPr>
-      <w:r>
-        <w:t>the same Phase 1 payload,</w:t>
-      </w:r>
-    </w:p>
-    <w:p>
-      <w:pPr>
-        <w:numPr>
-          <w:ilvl w:val="0"/>
-          <w:numId w:val="13"/>
-        </w:numPr>
-      </w:pPr>
-      <w:r>
-        <w:t>the same registries,</w:t>
-      </w:r>
-    </w:p>
-    <w:p>
-      <w:pPr>
-        <w:numPr>
-          <w:ilvl w:val="0"/>
-          <w:numId w:val="13"/>
-        </w:numPr>
-        <w:spacing w:after="240"/>
-      </w:pPr>
-      <w:r>
-        <w:t>the same engine version,</w:t>
-      </w:r>
-    </w:p>
-    <w:p>
-      <w:pPr>
-        <w:spacing w:before="240" w:after="240"/>
-      </w:pPr>
-      <w:proofErr w:type="gramStart"/>
-      <w:r>
-        <w:t>the</w:t>
-      </w:r>
-      <w:proofErr w:type="gramEnd"/>
-      <w:r>
-        <w:t xml:space="preserve"> engine must reproduce identical results or identical failures.</w:t>
-      </w:r>
-    </w:p>
-    <w:p>
-      <w:pPr>
-        <w:spacing w:before="240" w:after="240"/>
-      </w:pPr>
-      <w:r>
-        <w:pict w14:anchorId="3088A414">
-          <v:rect id="_x0000_i1043" style="width:0;height:1.5pt" o:hralign="center" o:hrstd="t" o:hr="t" fillcolor="#a0a0a0" stroked="f"/>
-        </w:pict>
-      </w:r>
-    </w:p>
-    <w:p>
-      <w:pPr>
-        <w:pStyle w:val="Heading2"/>
-        <w:keepNext w:val="0"/>
-        <w:keepLines w:val="0"/>
-        <w:spacing w:after="80"/>
-        <w:rPr>
-          <w:b/>
-          <w:bCs/>
-          <w:sz w:val="34"/>
-          <w:szCs w:val="34"/>
-        </w:rPr>
-      </w:pPr>
-      <w:bookmarkStart w:id="25" w:name="_e38lwcpsqoah" w:colFirst="0" w:colLast="0"/>
-      <w:bookmarkEnd w:id="25"/>
-      <w:r>
-        <w:rPr>
-          <w:b/>
-          <w:bCs/>
-          <w:sz w:val="34"/>
-          <w:szCs w:val="34"/>
-        </w:rPr>
-        <w:t>9. Non-Responsibilities (Explicit)</w:t>
-      </w:r>
-    </w:p>
-    <w:p>
-      <w:pPr>
-        <w:spacing w:before="240" w:after="240"/>
-      </w:pPr>
-      <w:r>
-        <w:t>This law explicitly forbids the engine from acting as:</w:t>
-      </w:r>
-    </w:p>
-    <w:p>
-      <w:pPr>
-        <w:numPr>
-          <w:ilvl w:val="0"/>
-          <w:numId w:val="16"/>
-        </w:numPr>
-        <w:spacing w:before="240"/>
-      </w:pPr>
-      <w:r>
-        <w:t>a planner,</w:t>
-      </w:r>
-    </w:p>
-    <w:p>
-      <w:pPr>
-        <w:numPr>
-          <w:ilvl w:val="0"/>
-          <w:numId w:val="16"/>
-        </w:numPr>
-      </w:pPr>
-      <w:r>
-        <w:t>a scheduler,</w:t>
-      </w:r>
-    </w:p>
-    <w:p>
-      <w:pPr>
-        <w:numPr>
-          <w:ilvl w:val="0"/>
-          <w:numId w:val="16"/>
-        </w:numPr>
-      </w:pPr>
-      <w:r>
-        <w:t>a capacity manager,</w:t>
-      </w:r>
-    </w:p>
-    <w:p>
-      <w:pPr>
-        <w:numPr>
-          <w:ilvl w:val="0"/>
-          <w:numId w:val="16"/>
-        </w:numPr>
-      </w:pPr>
-      <w:r>
-        <w:t>a conflict resolver,</w:t>
-      </w:r>
-    </w:p>
-    <w:p>
-      <w:pPr>
-        <w:numPr>
-          <w:ilvl w:val="0"/>
-          <w:numId w:val="16"/>
-        </w:numPr>
-        <w:spacing w:after="240"/>
-      </w:pPr>
-      <w:r>
-        <w:t>a recommendation system.</w:t>
-      </w:r>
-    </w:p>
-    <w:p>
-      <w:pPr>
-        <w:spacing w:before="240" w:after="240"/>
-      </w:pPr>
-      <w:r>
-        <w:t>Those are external concerns.</w:t>
-      </w:r>
-    </w:p>
-    <w:p>
-      <w:pPr>
-        <w:spacing w:before="240" w:after="240"/>
-      </w:pPr>
-      <w:r>
-        <w:pict w14:anchorId="2473968E">
-          <v:rect id="_x0000_i1044" style="width:0;height:1.5pt" o:hralign="center" o:hrstd="t" o:hr="t" fillcolor="#a0a0a0" stroked="f"/>
-        </w:pict>
-      </w:r>
-    </w:p>
-    <w:p>
-      <w:pPr>
-        <w:pStyle w:val="Heading2"/>
-        <w:keepNext w:val="0"/>
-        <w:keepLines w:val="0"/>
-        <w:spacing w:after="80"/>
-        <w:rPr>
-          <w:b/>
-          <w:bCs/>
-          <w:sz w:val="34"/>
-          <w:szCs w:val="34"/>
-        </w:rPr>
-      </w:pPr>
-      <w:bookmarkStart w:id="26" w:name="_6ogp91qb2qwt" w:colFirst="0" w:colLast="0"/>
-      <w:bookmarkEnd w:id="26"/>
-      <w:r>
-        <w:rPr>
-          <w:b/>
-          <w:bCs/>
-          <w:sz w:val="34"/>
-          <w:szCs w:val="34"/>
-        </w:rPr>
-        <w:t>10. Supremacy Clause</w:t>
-      </w:r>
-    </w:p>
-    <w:p>
-      <w:pPr>
-        <w:spacing w:before="240" w:after="240"/>
-      </w:pPr>
-      <w:r>
-        <w:t>In the event of conflict:</w:t>
-      </w:r>
-    </w:p>
-    <w:p>
-      <w:pPr>
-        <w:numPr>
-          <w:ilvl w:val="0"/>
-          <w:numId w:val="9"/>
-        </w:numPr>
-        <w:spacing w:before="240"/>
-      </w:pPr>
-      <w:r>
-        <w:t>CORE ENGINE, GOVERNANCE &amp; EXECUTION LAW</w:t>
-      </w:r>
-    </w:p>
-    <w:p>
-      <w:pPr>
-        <w:numPr>
-          <w:ilvl w:val="0"/>
-          <w:numId w:val="9"/>
-        </w:numPr>
-      </w:pPr>
-      <w:r>
-        <w:t>SESSION &amp; EVENT STRUCTURE LAW</w:t>
-      </w:r>
-    </w:p>
-    <w:p>
-      <w:pPr>
-        <w:numPr>
-          <w:ilvl w:val="0"/>
-          <w:numId w:val="9"/>
-        </w:numPr>
-      </w:pPr>
-      <w:r>
-        <w:t>REGISTRY LAW</w:t>
-      </w:r>
-    </w:p>
-    <w:p>
-      <w:pPr>
-        <w:numPr>
-          <w:ilvl w:val="0"/>
-          <w:numId w:val="9"/>
-        </w:numPr>
-      </w:pPr>
-      <w:r>
-        <w:t>PHASE 1 SCHEMA</w:t>
-      </w:r>
-    </w:p>
-    <w:p>
-      <w:pPr>
-        <w:numPr>
-          <w:ilvl w:val="0"/>
-          <w:numId w:val="9"/>
-        </w:numPr>
-      </w:pPr>
-      <w:r>
-        <w:t>DEV DOCS</w:t>
-      </w:r>
-    </w:p>
-    <w:p>
-      <w:pPr>
-        <w:numPr>
-          <w:ilvl w:val="0"/>
-          <w:numId w:val="9"/>
-        </w:numPr>
-        <w:spacing w:after="240"/>
-      </w:pPr>
-      <w:r>
-        <w:t>UI / Projection</w:t>
-      </w:r>
-    </w:p>
-    <w:p>
-      <w:pPr>
-        <w:spacing w:before="240" w:after="240"/>
-      </w:pPr>
-      <w:r>
-        <w:lastRenderedPageBreak/>
-        <w:t>Lower layers must yield without exception.</w:t>
-      </w:r>
-    </w:p>
-    <w:p>
-      <w:pPr>
-        <w:spacing w:before="240" w:after="240"/>
-      </w:pPr>
-    </w:p>
-    <w:p/>
-    <w:sectPr>
-      <w:pgSz w:w="12240" w:h="15840"/>
-      <w:pgMar w:top="1440" w:right="1440" w:bottom="1440" w:left="1440" w:header="720" w:footer="720" w:gutter="0"/>
-      <w:pgNumType w:start="1"/>
-      <w:cols w:space="720"/>
-    </w:sectPr>
-  </w:body>
-</w:document>
-</file>
 
 <file path=word/numbering.xml><?xml version="1.0" encoding="utf-8"?>
 <w:numbering xmlns:wpc="http://schemas.microsoft.com/office/word/2010/wordprocessingCanvas" xmlns:cx="http://schemas.microsoft.com/office/drawing/2014/chartex" xmlns:cx1="http://schemas.microsoft.com/office/drawing/2015/9/8/chartex" xmlns:cx2="http://schemas.microsoft.com/office/drawing/2015/10/21/chartex" xmlns:cx3="http://schemas.microsoft.com/office/drawing/2016/5/9/chartex" xmlns:cx4="http://schemas.microsoft.com/office/drawing/2016/5/10/chartex" xmlns:cx5="http://schemas.microsoft.com/office/drawing/2016/5/11/chartex" xmlns:cx6="http://schemas.microsoft.com/office/drawing/2016/5/12/chartex" xmlns:cx7="http://schemas.microsoft.com/office/drawing/2016/5/13/chartex" xmlns:cx8="http://schemas.microsoft.com/office/drawing/2016/5/14/chartex" xmlns:mc="http://schemas.openxmlformats.org/markup-compatibility/2006" xmlns:aink="http://schemas.microsoft.com/office/drawing/2016/ink" xmlns:am3d="http://schemas.microsoft.com/office/drawing/2017/model3d" xmlns:o="urn:schemas-microsoft-com:office:office" xmlns:oel="http://schemas.microsoft.com/office/2019/extlst" xmlns:r="http://schemas.openxmlformats.org/officeDocument/2006/relationships" xmlns:m="http://schemas.openxmlformats.org/officeDocument/2006/math" xmlns:v="urn:schemas-microsoft-com:vml" xmlns:wp14="http://schemas.microsoft.com/office/word/2010/wordprocessingDrawing" xmlns:wp="http://schemas.openxmlformats.org/drawingml/2006/wordprocessingDrawing" xmlns:w10="urn:schemas-microsoft-com:office:word" xmlns:w="http://schemas.openxmlformats.org/wordprocessingml/2006/main" xmlns:w14="http://schemas.microsoft.com/office/word/2010/wordml" xmlns:w15="http://schemas.microsoft.com/office/word/2012/wordml" xmlns:w16cex="http://schemas.microsoft.com/office/word/2018/wordml/cex" xmlns:w16cid="http://schemas.microsoft.com/office/word/2016/wordml/cid" xmlns:w16="http://schemas.microsoft.com/office/word/2018/wordml" xmlns:w16du="http://schemas.microsoft.com/office/word/2023/wordml/word16du" xmlns:w16sdtdh="http://schemas.microsoft.com/office/word/2020/wordml/sdtdatahash" xmlns:w16sdtfl="http://schemas.microsoft.com/office/word/2024/wordml/sdtformatlock" xmlns:w16se="http://schemas.microsoft.com/office/word/2015/wordml/symex" xmlns:wpg="http://schemas.microsoft.com/office/word/2010/wordprocessingGroup" xmlns:wpi="http://schemas.microsoft.com/office/word/2010/wordprocessingInk" xmlns:wne="http://schemas.microsoft.com/office/word/2006/wordml" xmlns:wps="http://schemas.microsoft.com/office/word/2010/wordprocessingShape" mc:Ignorable="w14 w15 w16se w16cid w16 w16cex w16sdtdh w16sdtfl w16du wp14">

</xml_diff>